<commit_message>
Roda o pipeline completo e atualiza dados/modelos; adiciona entregaveis do projeto
Reexecuta a ingestao (Bronze estatico + ANA/SNIRH ao vivo + Silver/Gold), retreina os 6
modelos Random Forest (producao) com validacao walk-forward, e regenera os diagnosticos SHAP.
MapBiomas/Earth Engine (uso do solo, sensoriamento historico) e a recalibracao ERA5/CMIP6 nao
foram reexecutados nesta rodada por exigirem credenciais (WATERWEAVE_EE_PROJECT/
WATERWEAVE_CDS_API_KEY) nao configuradas nesta maquina; as tabelas correspondentes mantem o
ultimo estado real ja ingerido. Suite de testes (153) passou integralmente apos o refresh.

Tambem inclui os relatorios, apresentacoes e diagramas gerados ao longo desta sessao
(docs/), documentando arquitetura de dados, algoritmos, resultados e pontos de publicacao
do projeto.

Co-Authored-By: Claude Sonnet 5 <noreply@anthropic.com>
</commit_message>
<xml_diff>
--- a/docs/Auditoria_Engenharia_Dados_WaterWeave_Tiete.docx
+++ b/docs/Auditoria_Engenharia_Dados_WaterWeave_Tiete.docx
@@ -114,6 +114,20 @@
           <w:sz w:val="22"/>
         </w:rPr>
         <w:t>O arquivo base_de_dados_pontos.xlsx contém 2.397.437 medições reais da rede CETESB (1978–2024, 699 pontos em todo o Estado de São Paulo, dos quais 32 no eixo do Rio Tietê, totalizando 137.452 medições reais disponíveis) — mas está registrado em RAW_SOURCES e NUNCA é lido por nenhum módulo bronze_*.py. Hoje, 100% dos indicadores de qualidade da água usados no dashboard, no modelo baseado em agentes (ABM) e nos modelos de Machine Learning (incluindo a análise SHAP anterior) vêm de Planilha_Historica_Solo_Sedimentos_Rio_Tiete.xlsx — uma planilha de apenas 258 linhas que a própria fonte declara como "simulada com base em tendências", não telemetria direta. Isso não invalida o que já foi construído (o pipeline trata essa proveniência corretamente via _fonte_tipo), mas significa que a base real e volumosa da CETESB permanece inexplorada.</w:t>
+      </w:r>
+    </w:p>
+    <w:p>
+      <w:pPr>
+        <w:spacing w:after="120" w:before="0"/>
+      </w:pPr>
+      <w:r>
+        <w:rPr>
+          <w:b/>
+          <w:i/>
+          <w:color w:val="B02A2A"/>
+          <w:sz w:val="21"/>
+        </w:rPr>
+        <w:t>ATUALIZAÇÃO (2026-07): este achado foi FECHADO — ver Seção 7 para o status de resolução e para três novas integrações de dado real (uso do solo, sensoriamento remoto, clima) feitas desde esta auditoria original.</w:t>
       </w:r>
     </w:p>
     <w:p>
@@ -4478,6 +4492,233 @@
     </w:p>
     <w:p>
       <w:pPr>
+        <w:pStyle w:val="Heading1"/>
+        <w:spacing w:before="440" w:after="200"/>
+      </w:pPr>
+      <w:r>
+        <w:rPr>
+          <w:color w:val="0E4C6E"/>
+          <w:sz w:val="32"/>
+        </w:rPr>
+        <w:t>7. Atualização (2026-07): Fechamento do Achado Crítico e Três Novas Fontes Reais</w:t>
+      </w:r>
+    </w:p>
+    <w:p>
+      <w:pPr>
+        <w:spacing w:after="160"/>
+        <w:jc w:val="both"/>
+      </w:pPr>
+      <w:r>
+        <w:rPr>
+          <w:sz w:val="22"/>
+        </w:rPr>
+        <w:t>Esta seção documenta o que mudou desde a auditoria original acima (Seções 1-6): o achado crítico foi fechado, e três novas fontes de dado real — inexistentes ou apenas simuladas na auditoria original — foram integradas ao pipeline. Mesmo padrão de rigor: números direto do pipeline materializado, não estimativas.</w:t>
+      </w:r>
+    </w:p>
+    <w:p>
+      <w:pPr>
+        <w:pStyle w:val="Heading2"/>
+        <w:spacing w:before="280" w:after="120"/>
+      </w:pPr>
+      <w:r>
+        <w:rPr>
+          <w:color w:val="0E4C6E"/>
+          <w:sz w:val="26"/>
+        </w:rPr>
+        <w:t>7.1 Achado crítico original: FECHADO</w:t>
+      </w:r>
+    </w:p>
+    <w:p>
+      <w:pPr>
+        <w:spacing w:after="160"/>
+        <w:jc w:val="both"/>
+      </w:pPr>
+      <w:r>
+        <w:rPr>
+          <w:sz w:val="22"/>
+        </w:rPr>
+        <w:t>bronze_cetesb.py (implementado com um desenho equivalente ao proposto na Seção 5.3, embora com nome de módulo diferente) hoje lê as 2.397.437 medições reais de base_de_dados_pontos.xlsx. silver_qualidade_cetesb.py filtra para os 32 pontos do eixo Tietê e pivota os parâmetros em colunas (iqa, od_mg_l, dbo_mg_l, metais_pesados_ppm). qualidade_real_com_fallback_simulado() (transform/gold_features.py) prioriza esse dado real sobre a planilha simulada de 258 linhas em toda linha (trecho, ano) onde os dois existem — a planilha simulada passou a servir só de preenchimento para 1940-1977 (antes do início da série real) e lacunas pontuais. Testes de guarda (tests/test_pipeline_paridade.py) impedem que uma fonte declarada em RAW_SOURCES fique sem módulo de ingestão correspondente sem que isso seja uma decisão consciente.</w:t>
+      </w:r>
+    </w:p>
+    <w:p>
+      <w:pPr>
+        <w:pStyle w:val="Heading2"/>
+        <w:spacing w:before="280" w:after="120"/>
+      </w:pPr>
+      <w:r>
+        <w:rPr>
+          <w:color w:val="0E4C6E"/>
+          <w:sz w:val="26"/>
+        </w:rPr>
+        <w:t>7.2 Nova fonte real: uso do solo (MapBiomas / Google Earth Engine)</w:t>
+      </w:r>
+    </w:p>
+    <w:p>
+      <w:pPr>
+        <w:spacing w:after="160"/>
+        <w:jc w:val="both"/>
+      </w:pPr>
+      <w:r>
+        <w:rPr>
+          <w:sz w:val="22"/>
+        </w:rPr>
+        <w:t>Na auditoria original, uso do solo só existia como texto categórico simulado ("Metropolitano/Industrial" etc.) em silver.qualidade. connectors/mapbiomas.py (novo) busca, via reduceRegion no servidor do Google Earth Engine, o percentual de área por macro-categoria (natural/agropecuária/urbano-industrial/água) da Coleção 9 do MapBiomas (1985-2023), num buffer de 5 km ao redor das estações reais de cada trecho. Resultado real: Alto Tietê urbanizou de 44,2% para 55,6% em 39 anos; Médio Tietê segue predominantemente agropecuário (70% em 2023); Baixo Tietê não registra nenhuma área urbano-industrial no buffer das suas 2 estações reais. Essa variável já entra como preditora real nos modelos de ML (antes um substituto categórico grosseiro, trecho_id).</w:t>
+      </w:r>
+    </w:p>
+    <w:p>
+      <w:pPr>
+        <w:pStyle w:val="Heading2"/>
+        <w:spacing w:before="280" w:after="120"/>
+      </w:pPr>
+      <w:r>
+        <w:rPr>
+          <w:color w:val="0E4C6E"/>
+          <w:sz w:val="26"/>
+        </w:rPr>
+        <w:t>7.3 Nova fonte real: sensoriamento remoto histórico (Landsat / Google Earth Engine)</w:t>
+      </w:r>
+    </w:p>
+    <w:p>
+      <w:pPr>
+        <w:spacing w:after="160"/>
+        <w:jc w:val="both"/>
+      </w:pPr>
+      <w:r>
+        <w:rPr>
+          <w:sz w:val="22"/>
+        </w:rPr>
+        <w:t>A planilha Sensoriamento_Remoto_Rio_Tiete.xlsx (14 linhas, autodeclarada "Simulação Consolidada") permanece como fallback, mas connectors/sensoriamento_historico.py (novo) busca a série histórica REAL (NDVI, temperatura de superfície, proxy de turbidez via NDTI) via Landsat Collection 2 (satélites 5/7/8/9, sem lacuna, 1984-presente). Primeira execução real: 903 observações, 7 pontos de monitoramento, 1984-2026. A fusão com a planilha ilustrativa (sensoriamento_real_com_fallback_ilustrativo, mesmo padrão de prioridade real &gt; simulado da Seção 7.1) resultou em 126 dos 129 registros (trecho, ano) de gold.sensoriamento_trecho_ano hoje 100% reais.</w:t>
+      </w:r>
+    </w:p>
+    <w:p>
+      <w:pPr>
+        <w:spacing w:after="160"/>
+        <w:jc w:val="both"/>
+      </w:pPr>
+      <w:r>
+        <w:rPr>
+          <w:sz w:val="22"/>
+        </w:rPr>
+        <w:t>Ressalva de engenharia (mesmo padrão de honestidade desta auditoria): os índices espectrais nunca foram calibrados contra medição in situ do Tietê — plausíveis à luz da literatura geral (NDVI de mata ciliar preservada esperado em 0,6-0,85; o Médio Tietê real mede 0,63 em média), mas o proxy de turbidez (NDTI) NÃO é a Turbidez em NTU da CETESB, e não há par (imagem, medição simultânea) disponível neste projeto para uma regressão de calibração formal.</w:t>
+      </w:r>
+    </w:p>
+    <w:p>
+      <w:pPr>
+        <w:pStyle w:val="Heading2"/>
+        <w:spacing w:before="280" w:after="120"/>
+      </w:pPr>
+      <w:r>
+        <w:rPr>
+          <w:color w:val="0E4C6E"/>
+          <w:sz w:val="26"/>
+        </w:rPr>
+        <w:t>7.4 Nova fonte real: clima (ERA5 / CMIP6 via Copernicus Climate Data Store)</w:t>
+      </w:r>
+    </w:p>
+    <w:p>
+      <w:pPr>
+        <w:spacing w:after="160"/>
+        <w:jc w:val="both"/>
+      </w:pPr>
+      <w:r>
+        <w:rPr>
+          <w:sz w:val="22"/>
+        </w:rPr>
+        <w:t>connectors/era5_cmip6.py busca reanálise histórica ERA5 (temperatura/precipitação mensal observada) e projeções futuras CMIP6 (cenários de emissão SSP1-2.6/SSP2-4.5/SSP5-8.5). A primeira execução real revelou três divergências entre a documentação pública da API e o comportamento real do serviço, corrigidas antes de qualquer número ser aceito como válido:</w:t>
+      </w:r>
+    </w:p>
+    <w:p>
+      <w:pPr>
+        <w:pStyle w:val="ListBullet"/>
+        <w:spacing w:after="80"/>
+      </w:pPr>
+      <w:r>
+        <w:rPr>
+          <w:sz w:val="22"/>
+        </w:rPr>
+        <w:t>ERA5: mesmo pedindo um único arquivo NetCDF, a API retorna temperatura e precipitação em DOIS arquivos separados dentro de um .zip, com horários nominalmente diferentes dentro do mesmo mês — corrigido fundindo por mês-calendário em vez de timestamp exato.</w:t>
+      </w:r>
+    </w:p>
+    <w:p>
+      <w:pPr>
+        <w:pStyle w:val="ListBullet"/>
+        <w:spacing w:after="80"/>
+      </w:pPr>
+      <w:r>
+        <w:rPr>
+          <w:sz w:val="22"/>
+        </w:rPr>
+        <w:t>CMIP6: o id técnico de cenário usa sublinhados entre dígitos ("ssp2_4_5", não "ssp245" como a documentação de exemplos sugere); o parâmetro de nível vertical não deve ser enviado para variáveis de superfície (o conjunto de níveis válidos é vazio para elas); e pedir temperatura e precipitação na mesma requisição faz a API descartar a precipitação em silêncio, sem erro — corrigido fazendo uma requisição por variável.</w:t>
+      </w:r>
+    </w:p>
+    <w:p>
+      <w:pPr>
+        <w:spacing w:after="160"/>
+        <w:jc w:val="both"/>
+      </w:pPr>
+      <w:r>
+        <w:rPr>
+          <w:sz w:val="22"/>
+        </w:rPr>
+        <w:t>Resultado real, já validado: a calibração do fator climático usado no modelo baseado em agentes (baseline CMIP6 historical 1995-2014 vs. projeção SSP5-8.5 2040-2060, modelo mpi_esm1_2_lr) retornou um fator de 0,982 — o cenário de emissões mais extremo do IPCC AR6 fica apenas ~1,8% mais seco que o baseline, muito menos severo que o proxy fixo de -25% usado até então no cenário "Mudança Climática Extrema" do ABM. Este número, baseado em um único modelo CMIP6 (não um ensemble), já substitui o proxy fixo em produção.</w:t>
+      </w:r>
+    </w:p>
+    <w:p>
+      <w:pPr>
+        <w:pStyle w:val="Heading2"/>
+        <w:spacing w:before="280" w:after="120"/>
+      </w:pPr>
+      <w:r>
+        <w:rPr>
+          <w:color w:val="0E4C6E"/>
+          <w:sz w:val="26"/>
+        </w:rPr>
+        <w:t>7.5 Recomendações adicionais</w:t>
+      </w:r>
+    </w:p>
+    <w:p>
+      <w:pPr>
+        <w:pStyle w:val="ListBullet"/>
+        <w:spacing w:after="80"/>
+      </w:pPr>
+      <w:r>
+        <w:rPr>
+          <w:sz w:val="22"/>
+        </w:rPr>
+        <w:t>Ensemble multi-modelo CMIP6 (hoje um único modelo, mpi_esm1_2_lr) para reduzir incerteza estrutural antes de tratar o fator climático calibrado como definitivo.</w:t>
+      </w:r>
+    </w:p>
+    <w:p>
+      <w:pPr>
+        <w:pStyle w:val="ListBullet"/>
+        <w:spacing w:after="80"/>
+      </w:pPr>
+      <w:r>
+        <w:rPr>
+          <w:sz w:val="22"/>
+        </w:rPr>
+        <w:t>Religar a reanálise ERA5 para calibrar a variabilidade climática do ABM, hoje calculada só a partir da climatologia pluviométrica DAEE.</w:t>
+      </w:r>
+    </w:p>
+    <w:p>
+      <w:pPr>
+        <w:pStyle w:val="ListBullet"/>
+        <w:spacing w:after="80"/>
+      </w:pPr>
+      <w:r>
+        <w:rPr>
+          <w:sz w:val="22"/>
+        </w:rPr>
+        <w:t>Buscar um par (imagem Landsat, medição in situ simultânea) para calibrar formalmente os índices espectrais (NDVI/NDTI) contra Turbidez/Clorofila-a reais da CETESB — sem isso, a atribuição de causa por sensoriamento remoto (erosão vs. alga vs. despejo industrial) continua só estatística sobre parâmetro de laboratório, não sobre reflectância de banda real.</w:t>
+      </w:r>
+    </w:p>
+    <w:p>
+      <w:r>
+        <w:br w:type="page"/>
+      </w:r>
+    </w:p>
+    <w:p>
+      <w:pPr>
         <w:spacing w:after="120" w:before="0"/>
       </w:pPr>
       <w:r>

</xml_diff>